<commit_message>
bo sung minh chung
</commit_message>
<xml_diff>
--- a/MinhChung.docx
+++ b/MinhChung.docx
@@ -1,6 +1,6 @@
 
 <file path=word/document.xml><?xml version="1.0" encoding="utf-8"?>
-<w:document xmlns:wpc="http://schemas.microsoft.com/office/word/2010/wordprocessingCanvas" xmlns:cx="http://schemas.microsoft.com/office/drawing/2014/chartex" xmlns:cx1="http://schemas.microsoft.com/office/drawing/2015/9/8/chartex" xmlns:cx2="http://schemas.microsoft.com/office/drawing/2015/10/21/chartex" xmlns:cx3="http://schemas.microsoft.com/office/drawing/2016/5/9/chartex" xmlns:cx4="http://schemas.microsoft.com/office/drawing/2016/5/10/chartex" xmlns:cx5="http://schemas.microsoft.com/office/drawing/2016/5/11/chartex" xmlns:cx6="http://schemas.microsoft.com/office/drawing/2016/5/12/chartex" xmlns:cx7="http://schemas.microsoft.com/office/drawing/2016/5/13/chartex" xmlns:cx8="http://schemas.microsoft.com/office/drawing/2016/5/14/chartex" xmlns:mc="http://schemas.openxmlformats.org/markup-compatibility/2006" xmlns:aink="http://schemas.microsoft.com/office/drawing/2016/ink" xmlns:am3d="http://schemas.microsoft.com/office/drawing/2017/model3d" xmlns:o="urn:schemas-microsoft-com:office:office" xmlns:oel="http://schemas.microsoft.com/office/2019/extlst" xmlns:r="http://schemas.openxmlformats.org/officeDocument/2006/relationships" xmlns:m="http://schemas.openxmlformats.org/officeDocument/2006/math" xmlns:v="urn:schemas-microsoft-com:vml" xmlns:wp14="http://schemas.microsoft.com/office/word/2010/wordprocessingDrawing" xmlns:wp="http://schemas.openxmlformats.org/drawingml/2006/wordprocessingDrawing" xmlns:w10="urn:schemas-microsoft-com:office:word" xmlns:w="http://schemas.openxmlformats.org/wordprocessingml/2006/main" xmlns:w14="http://schemas.microsoft.com/office/word/2010/wordml" xmlns:w15="http://schemas.microsoft.com/office/word/2012/wordml" xmlns:w16cex="http://schemas.microsoft.com/office/word/2018/wordml/cex" xmlns:w16cid="http://schemas.microsoft.com/office/word/2016/wordml/cid" xmlns:w16="http://schemas.microsoft.com/office/word/2018/wordml" xmlns:w16du="http://schemas.microsoft.com/office/word/2023/wordml/word16du" xmlns:w16sdtdh="http://schemas.microsoft.com/office/word/2020/wordml/sdtdatahash" xmlns:w16sdtfl="http://schemas.microsoft.com/office/word/2024/wordml/sdtformatlock" xmlns:w16se="http://schemas.microsoft.com/office/word/2015/wordml/symex" xmlns:wpg="http://schemas.microsoft.com/office/word/2010/wordprocessingGroup" xmlns:wpi="http://schemas.microsoft.com/office/word/2010/wordprocessingInk" xmlns:wne="http://schemas.microsoft.com/office/word/2006/wordml" xmlns:wps="http://schemas.microsoft.com/office/word/2010/wordprocessingShape" mc:Ignorable="w14 w15 w16se w16cid w16 w16cex w16sdtdh w16sdtfl w16du wp14">
+<w:document xmlns:wpc="http://schemas.microsoft.com/office/word/2010/wordprocessingCanvas" xmlns:mc="http://schemas.openxmlformats.org/markup-compatibility/2006" xmlns:o="urn:schemas-microsoft-com:office:office" xmlns:r="http://schemas.openxmlformats.org/officeDocument/2006/relationships" xmlns:m="http://schemas.openxmlformats.org/officeDocument/2006/math" xmlns:v="urn:schemas-microsoft-com:vml" xmlns:wp14="http://schemas.microsoft.com/office/word/2010/wordprocessingDrawing" xmlns:wp="http://schemas.openxmlformats.org/drawingml/2006/wordprocessingDrawing" xmlns:w10="urn:schemas-microsoft-com:office:word" xmlns:w="http://schemas.openxmlformats.org/wordprocessingml/2006/main" xmlns:w14="http://schemas.microsoft.com/office/word/2010/wordml" xmlns:w15="http://schemas.microsoft.com/office/word/2012/wordml" xmlns:wpg="http://schemas.microsoft.com/office/word/2010/wordprocessingGroup" xmlns:wpi="http://schemas.microsoft.com/office/word/2010/wordprocessingInk" xmlns:wne="http://schemas.microsoft.com/office/word/2006/wordml" xmlns:wps="http://schemas.microsoft.com/office/word/2010/wordprocessingShape" mc:Ignorable="w14 w15 wp14">
   <w:body>
     <w:p>
       <w:pPr>
@@ -8,14 +8,27 @@
         <w:jc w:val="center"/>
       </w:pPr>
       <w:r>
-        <w:t>Tên: Nguyễn Thanh Tú MSSV:22691321</w:t>
-      </w:r>
+        <w:t>Tên: Nguyễn Thanh Tú MSSV</w:t>
+      </w:r>
+      <w:proofErr w:type="gramStart"/>
+      <w:r>
+        <w:t>:22691321</w:t>
+      </w:r>
+      <w:proofErr w:type="gramEnd"/>
       <w:r>
         <w:t xml:space="preserve"> Tuần 2</w:t>
       </w:r>
     </w:p>
     <w:sdt>
       <w:sdtPr>
+        <w:rPr>
+          <w:rFonts w:ascii="Times New Roman" w:eastAsiaTheme="minorHAnsi" w:hAnsi="Times New Roman" w:cstheme="minorBidi"/>
+          <w:color w:val="auto"/>
+          <w:kern w:val="2"/>
+          <w:sz w:val="26"/>
+          <w:szCs w:val="24"/>
+          <w14:ligatures w14:val="standardContextual"/>
+        </w:rPr>
         <w:id w:val="-333615483"/>
         <w:docPartObj>
           <w:docPartGallery w:val="Table of Contents"/>
@@ -24,15 +37,9 @@
       </w:sdtPr>
       <w:sdtEndPr>
         <w:rPr>
-          <w:rFonts w:ascii="Times New Roman" w:eastAsiaTheme="minorHAnsi" w:hAnsi="Times New Roman" w:cstheme="minorBidi"/>
           <w:b/>
           <w:bCs/>
           <w:noProof/>
-          <w:color w:val="auto"/>
-          <w:kern w:val="2"/>
-          <w:sz w:val="26"/>
-          <w:szCs w:val="24"/>
-          <w14:ligatures w14:val="standardContextual"/>
         </w:rPr>
       </w:sdtEndPr>
       <w:sdtContent>
@@ -461,7 +468,15 @@
     </w:p>
     <w:p>
       <w:r>
-        <w:t>Trong ví dụ của bài, hệ thống có một interface Animal định nghĩa hành vi chung là phương thức speak(). Các lớp cụ thể như Cow, Dog và Cat sẽ triển khai interface này và định nghĩa cách phát ra âm thanh riêng của từng loài.</w:t>
+        <w:t xml:space="preserve">Trong ví dụ của bài, hệ thống có một interface Animal định nghĩa hành vi chung là phương thức </w:t>
+      </w:r>
+      <w:proofErr w:type="gramStart"/>
+      <w:r>
+        <w:t>speak(</w:t>
+      </w:r>
+      <w:proofErr w:type="gramEnd"/>
+      <w:r>
+        <w:t>). Các lớp cụ thể như Cow, Dog và Cat sẽ triển khai interface này và định nghĩa cách phát ra âm thanh riêng của từng loài.</w:t>
       </w:r>
     </w:p>
     <w:p>
@@ -473,7 +488,15 @@
         <w:t xml:space="preserve"> là </w:t>
       </w:r>
       <w:r>
-        <w:t>abstract class khai báo phương thức createAnimal()</w:t>
+        <w:t xml:space="preserve">abstract class khai báo phương thức </w:t>
+      </w:r>
+      <w:proofErr w:type="gramStart"/>
+      <w:r>
+        <w:t>createAnimal(</w:t>
+      </w:r>
+      <w:proofErr w:type="gramEnd"/>
+      <w:r>
+        <w:t>)</w:t>
       </w:r>
       <w:r>
         <w:t xml:space="preserve"> </w:t>
@@ -484,7 +507,15 @@
     </w:p>
     <w:p>
       <w:r>
-        <w:t>Các lớp CowFactory, DogFactory và CatFactory kế thừa từ AnimalFactory và cài đặt phương thức createAnimal(). Mỗi factory sẽ chịu trách nhiệm tạo ra một đối tượng cụ thể tương ứng</w:t>
+        <w:t xml:space="preserve">Các lớp CowFactory, DogFactory và CatFactory kế thừa từ AnimalFactory và cài đặt phương thức </w:t>
+      </w:r>
+      <w:proofErr w:type="gramStart"/>
+      <w:r>
+        <w:t>createAnimal(</w:t>
+      </w:r>
+      <w:proofErr w:type="gramEnd"/>
+      <w:r>
+        <w:t>). Mỗi factory sẽ chịu trách nhiệm tạo ra một đối tượng cụ thể tương ứng</w:t>
       </w:r>
     </w:p>
     <w:p>
@@ -1800,16 +1831,29 @@
         <w:ind w:firstLine="0"/>
       </w:pPr>
       <w:r>
-        <w:t>Ở bài 1 hệ thống quản lí đơn hàng  ta sẽ dùng state pattern cụ thể:</w:t>
-      </w:r>
-    </w:p>
-    <w:p>
-      <w:pPr>
-        <w:ind w:firstLine="0"/>
-      </w:pPr>
-      <w:r>
-        <w:t>Ý tưởng sẽ là đơn hàng có nhiều state như :</w:t>
-      </w:r>
+        <w:t xml:space="preserve">Ở bài 1 hệ thống quản lí đơn </w:t>
+      </w:r>
+      <w:proofErr w:type="gramStart"/>
+      <w:r>
+        <w:t>hàng  ta</w:t>
+      </w:r>
+      <w:proofErr w:type="gramEnd"/>
+      <w:r>
+        <w:t xml:space="preserve"> sẽ dùng state pattern cụ thể:</w:t>
+      </w:r>
+    </w:p>
+    <w:p>
+      <w:pPr>
+        <w:ind w:firstLine="0"/>
+      </w:pPr>
+      <w:r>
+        <w:t xml:space="preserve">Ý tưởng sẽ là đơn hàng có nhiều state </w:t>
+      </w:r>
+      <w:proofErr w:type="gramStart"/>
+      <w:r>
+        <w:t>như :</w:t>
+      </w:r>
+      <w:proofErr w:type="gramEnd"/>
     </w:p>
     <w:p>
       <w:pPr>
@@ -1860,7 +1904,15 @@
         <w:ind w:firstLine="0"/>
       </w:pPr>
       <w:r>
-        <w:t>Ta sẽ có order state định nghĩa hành vi chung cho mọi trạng thái:</w:t>
+        <w:t xml:space="preserve">Ta sẽ có order state định nghĩa hành </w:t>
+      </w:r>
+      <w:proofErr w:type="gramStart"/>
+      <w:r>
+        <w:t>vi</w:t>
+      </w:r>
+      <w:proofErr w:type="gramEnd"/>
+      <w:r>
+        <w:t xml:space="preserve"> chung cho mọi trạng thái:</w:t>
       </w:r>
     </w:p>
     <w:p>
@@ -2031,8 +2083,13 @@
       <w:r>
         <w:t xml:space="preserve">Lần chạy </w:t>
       </w:r>
-      <w:r>
-        <w:t>order.process();</w:t>
+      <w:proofErr w:type="gramStart"/>
+      <w:r>
+        <w:t>order.process(</w:t>
+      </w:r>
+      <w:proofErr w:type="gramEnd"/>
+      <w:r>
+        <w:t>);</w:t>
       </w:r>
       <w:r>
         <w:t xml:space="preserve"> thứ nhất trong ordercontext ta có:</w:t>
@@ -2042,8 +2099,13 @@
       <w:pPr>
         <w:ind w:firstLine="0"/>
       </w:pPr>
-      <w:r>
-        <w:t>public void process() {</w:t>
+      <w:proofErr w:type="gramStart"/>
+      <w:r>
+        <w:t>public</w:t>
+      </w:r>
+      <w:proofErr w:type="gramEnd"/>
+      <w:r>
+        <w:t xml:space="preserve"> void process() {</w:t>
       </w:r>
       <w:r>
         <w:br/>
@@ -2058,8 +2120,13 @@
       <w:pPr>
         <w:ind w:firstLine="0"/>
       </w:pPr>
-      <w:r>
-        <w:t xml:space="preserve">lúc này state sẽ được gán là NewOrderState và gọi </w:t>
+      <w:proofErr w:type="gramStart"/>
+      <w:r>
+        <w:t>lúc</w:t>
+      </w:r>
+      <w:proofErr w:type="gramEnd"/>
+      <w:r>
+        <w:t xml:space="preserve"> này state sẽ được gán là NewOrderState và gọi </w:t>
       </w:r>
       <w:r>
         <w:t>NewOrderState.handle()</w:t>
@@ -2069,24 +2136,45 @@
       <w:pPr>
         <w:ind w:firstLine="0"/>
       </w:pPr>
-      <w:r>
-        <w:t>public void handle(OrderContext context) {</w:t>
-      </w:r>
-    </w:p>
-    <w:p>
-      <w:pPr>
-        <w:ind w:firstLine="0"/>
-      </w:pPr>
-      <w:r>
-        <w:t xml:space="preserve">    System.out.println("Kiểm tra thông tin đơn hàng...");</w:t>
-      </w:r>
-    </w:p>
-    <w:p>
-      <w:pPr>
-        <w:ind w:firstLine="0"/>
-      </w:pPr>
-      <w:r>
-        <w:t xml:space="preserve">    context.setState(new ProcessingState());</w:t>
+      <w:proofErr w:type="gramStart"/>
+      <w:r>
+        <w:t>public</w:t>
+      </w:r>
+      <w:proofErr w:type="gramEnd"/>
+      <w:r>
+        <w:t xml:space="preserve"> void handle(OrderContext context) {</w:t>
+      </w:r>
+    </w:p>
+    <w:p>
+      <w:pPr>
+        <w:ind w:firstLine="0"/>
+      </w:pPr>
+      <w:r>
+        <w:t xml:space="preserve">    </w:t>
+      </w:r>
+      <w:proofErr w:type="gramStart"/>
+      <w:r>
+        <w:t>System.out.println(</w:t>
+      </w:r>
+      <w:proofErr w:type="gramEnd"/>
+      <w:r>
+        <w:t>"Kiểm tra thông tin đơn hàng...");</w:t>
+      </w:r>
+    </w:p>
+    <w:p>
+      <w:pPr>
+        <w:ind w:firstLine="0"/>
+      </w:pPr>
+      <w:r>
+        <w:t xml:space="preserve">    </w:t>
+      </w:r>
+      <w:proofErr w:type="gramStart"/>
+      <w:r>
+        <w:t>context.setState(</w:t>
+      </w:r>
+      <w:proofErr w:type="gramEnd"/>
+      <w:r>
+        <w:t>new ProcessingState());</w:t>
       </w:r>
     </w:p>
     <w:p>
@@ -2186,7 +2274,61 @@
         <w:ind w:firstLine="0"/>
       </w:pPr>
       <w:r>
-        <w:t>Vì vậy, trong bài này State Pattern được dùng để mô hình hóa vòng đời của đơn hàng và quản lý việc chuyển đổi giữa các trạng thái của đơn hàng trong hệ thống.</w:t>
+        <w:t xml:space="preserve">Vì vậy, trong bài </w:t>
+      </w:r>
+      <w:proofErr w:type="gramStart"/>
+      <w:r>
+        <w:t>này</w:t>
+      </w:r>
+      <w:proofErr w:type="gramEnd"/>
+      <w:r>
+        <w:t xml:space="preserve"> State Pattern được dùng để mô hình hóa vòng đời của đơn hàng và quản lý việc chuyển đổi giữa các trạng thái của đơn hàng trong hệ thống.</w:t>
+      </w:r>
+    </w:p>
+    <w:p>
+      <w:pPr>
+        <w:ind w:firstLine="0"/>
+      </w:pPr>
+      <w:r>
+        <w:rPr>
+          <w:noProof/>
+        </w:rPr>
+        <w:lastRenderedPageBreak/>
+        <w:drawing>
+          <wp:inline distT="0" distB="0" distL="0" distR="0" wp14:anchorId="47D26A53" wp14:editId="74B4ED46">
+            <wp:extent cx="5943600" cy="2731770"/>
+            <wp:effectExtent l="0" t="0" r="0" b="0"/>
+            <wp:docPr id="1" name="Picture 1"/>
+            <wp:cNvGraphicFramePr>
+              <a:graphicFrameLocks xmlns:a="http://schemas.openxmlformats.org/drawingml/2006/main" noChangeAspect="1"/>
+            </wp:cNvGraphicFramePr>
+            <a:graphic xmlns:a="http://schemas.openxmlformats.org/drawingml/2006/main">
+              <a:graphicData uri="http://schemas.openxmlformats.org/drawingml/2006/picture">
+                <pic:pic xmlns:pic="http://schemas.openxmlformats.org/drawingml/2006/picture">
+                  <pic:nvPicPr>
+                    <pic:cNvPr id="1" name=""/>
+                    <pic:cNvPicPr/>
+                  </pic:nvPicPr>
+                  <pic:blipFill>
+                    <a:blip r:embed="rId12"/>
+                    <a:stretch>
+                      <a:fillRect/>
+                    </a:stretch>
+                  </pic:blipFill>
+                  <pic:spPr>
+                    <a:xfrm>
+                      <a:off x="0" y="0"/>
+                      <a:ext cx="5943600" cy="2731770"/>
+                    </a:xfrm>
+                    <a:prstGeom prst="rect">
+                      <a:avLst/>
+                    </a:prstGeom>
+                  </pic:spPr>
+                </pic:pic>
+              </a:graphicData>
+            </a:graphic>
+          </wp:inline>
+        </w:drawing>
       </w:r>
     </w:p>
     <w:p>
@@ -2226,7 +2368,15 @@
         <w:t xml:space="preserve">Các loại thuế khác nhau </w:t>
       </w:r>
       <w:r>
-        <w:t>sẽ có thuật toán khác nhau vd:</w:t>
+        <w:t xml:space="preserve">sẽ có thuật toán khác nhau </w:t>
+      </w:r>
+      <w:proofErr w:type="gramStart"/>
+      <w:r>
+        <w:t>vd</w:t>
+      </w:r>
+      <w:proofErr w:type="gramEnd"/>
+      <w:r>
+        <w:t>:</w:t>
       </w:r>
     </w:p>
     <w:p>
@@ -2251,7 +2401,6 @@
         </w:numPr>
       </w:pPr>
       <w:r>
-        <w:lastRenderedPageBreak/>
         <w:t>Consumption Tax</w:t>
       </w:r>
       <w:r>
@@ -2283,7 +2432,15 @@
         <w:t xml:space="preserve"> </w:t>
       </w:r>
       <w:r>
-        <w:t>định nghĩa thuật toán chung để tính thuế</w:t>
+        <w:t xml:space="preserve">định nghĩa thuật toán </w:t>
+      </w:r>
+      <w:proofErr w:type="gramStart"/>
+      <w:r>
+        <w:t>chung</w:t>
+      </w:r>
+      <w:proofErr w:type="gramEnd"/>
+      <w:r>
+        <w:t xml:space="preserve"> để tính thuế</w:t>
       </w:r>
       <w:r>
         <w:t>:</w:t>
@@ -2313,7 +2470,7 @@
                     <pic:cNvPicPr/>
                   </pic:nvPicPr>
                   <pic:blipFill>
-                    <a:blip r:embed="rId12"/>
+                    <a:blip r:embed="rId13"/>
                     <a:stretch>
                       <a:fillRect/>
                     </a:stretch>
@@ -2364,6 +2521,7 @@
         <w:rPr>
           <w:noProof/>
         </w:rPr>
+        <w:lastRenderedPageBreak/>
         <w:drawing>
           <wp:inline distT="0" distB="0" distL="0" distR="0" wp14:anchorId="0523DED7" wp14:editId="31BA0478">
             <wp:extent cx="5943600" cy="1297305"/>
@@ -2380,7 +2538,7 @@
                     <pic:cNvPicPr/>
                   </pic:nvPicPr>
                   <pic:blipFill>
-                    <a:blip r:embed="rId13"/>
+                    <a:blip r:embed="rId14"/>
                     <a:stretch>
                       <a:fillRect/>
                     </a:stretch>
@@ -2439,7 +2597,7 @@
                     <pic:cNvPicPr/>
                   </pic:nvPicPr>
                   <pic:blipFill>
-                    <a:blip r:embed="rId14"/>
+                    <a:blip r:embed="rId15"/>
                     <a:stretch>
                       <a:fillRect/>
                     </a:stretch>
@@ -2482,7 +2640,6 @@
         <w:rPr>
           <w:noProof/>
         </w:rPr>
-        <w:lastRenderedPageBreak/>
         <w:drawing>
           <wp:inline distT="0" distB="0" distL="0" distR="0" wp14:anchorId="28F95409" wp14:editId="7A8BE79E">
             <wp:extent cx="5943600" cy="1993900"/>
@@ -2499,7 +2656,7 @@
                     <pic:cNvPicPr/>
                   </pic:nvPicPr>
                   <pic:blipFill>
-                    <a:blip r:embed="rId15"/>
+                    <a:blip r:embed="rId16"/>
                     <a:stretch>
                       <a:fillRect/>
                     </a:stretch>
@@ -2536,6 +2693,7 @@
         <w:rPr>
           <w:noProof/>
         </w:rPr>
+        <w:lastRenderedPageBreak/>
         <w:drawing>
           <wp:inline distT="0" distB="0" distL="0" distR="0" wp14:anchorId="76320320" wp14:editId="0B0C2C7E">
             <wp:extent cx="5943600" cy="1870075"/>
@@ -2552,7 +2710,7 @@
                     <pic:cNvPicPr/>
                   </pic:nvPicPr>
                   <pic:blipFill>
-                    <a:blip r:embed="rId16"/>
+                    <a:blip r:embed="rId17"/>
                     <a:stretch>
                       <a:fillRect/>
                     </a:stretch>
@@ -2577,8 +2735,13 @@
       <w:pPr>
         <w:ind w:firstLine="0"/>
       </w:pPr>
-      <w:r>
-        <w:t>Vd về luồng chạy chương trình:</w:t>
+      <w:proofErr w:type="gramStart"/>
+      <w:r>
+        <w:t>Vd</w:t>
+      </w:r>
+      <w:proofErr w:type="gramEnd"/>
+      <w:r>
+        <w:t xml:space="preserve"> về luồng chạy chương trình:</w:t>
       </w:r>
     </w:p>
     <w:p>
@@ -2605,7 +2768,7 @@
                     <pic:cNvPicPr/>
                   </pic:nvPicPr>
                   <pic:blipFill>
-                    <a:blip r:embed="rId17"/>
+                    <a:blip r:embed="rId18"/>
                     <a:stretch>
                       <a:fillRect/>
                     </a:stretch>
@@ -2631,7 +2794,15 @@
         <w:ind w:firstLine="0"/>
       </w:pPr>
       <w:r>
-        <w:t>Product p1 = new Product(new VATTax());</w:t>
+        <w:t xml:space="preserve">Product p1 = new </w:t>
+      </w:r>
+      <w:proofErr w:type="gramStart"/>
+      <w:r>
+        <w:t>Product(</w:t>
+      </w:r>
+      <w:proofErr w:type="gramEnd"/>
+      <w:r>
+        <w:t>new VATTax());</w:t>
       </w:r>
     </w:p>
     <w:p>
@@ -2645,19 +2816,31 @@
         <w:t>taxStrategy = VATTax</w:t>
       </w:r>
       <w:r>
-        <w:t xml:space="preserve"> (nếu đổi strategy vd Luxury Tax taxStrattegy sẽ bằng LuxuryTax</w:t>
-      </w:r>
-    </w:p>
-    <w:p>
-      <w:pPr>
-        <w:ind w:firstLine="0"/>
-      </w:pPr>
-      <w:r>
-        <w:lastRenderedPageBreak/>
+        <w:t xml:space="preserve"> (nếu đổi strategy </w:t>
+      </w:r>
+      <w:proofErr w:type="gramStart"/>
+      <w:r>
+        <w:t>vd</w:t>
+      </w:r>
+      <w:proofErr w:type="gramEnd"/>
+      <w:r>
+        <w:t xml:space="preserve"> Luxury Tax taxStrattegy sẽ bằng LuxuryTax</w:t>
+      </w:r>
+    </w:p>
+    <w:p>
+      <w:pPr>
+        <w:ind w:firstLine="0"/>
+      </w:pPr>
+      <w:r>
         <w:t xml:space="preserve">Khi ta chạy </w:t>
       </w:r>
-      <w:r>
-        <w:t>p1.calculateTotal(100)</w:t>
+      <w:proofErr w:type="gramStart"/>
+      <w:r>
+        <w:t>p1.calculateTotal(</w:t>
+      </w:r>
+      <w:proofErr w:type="gramEnd"/>
+      <w:r>
+        <w:t>100)</w:t>
       </w:r>
       <w:r>
         <w:t xml:space="preserve"> sẽ trả về </w:t>
@@ -2677,7 +2860,15 @@
         <w:ind w:firstLine="0"/>
       </w:pPr>
       <w:r>
-        <w:t xml:space="preserve">Luồng hoạt động:Product </w:t>
+        <w:t>Luồng hoạt động</w:t>
+      </w:r>
+      <w:proofErr w:type="gramStart"/>
+      <w:r>
+        <w:t>:Product</w:t>
+      </w:r>
+      <w:proofErr w:type="gramEnd"/>
+      <w:r>
+        <w:t xml:space="preserve"> </w:t>
       </w:r>
       <w:r>
         <w:sym w:font="Wingdings" w:char="F0E0"/>
@@ -2710,9 +2901,11 @@
       <w:pPr>
         <w:ind w:firstLine="0"/>
       </w:pPr>
+      <w:proofErr w:type="gramStart"/>
       <w:r>
         <w:t>taxStrategy.calculateTax()</w:t>
       </w:r>
+      <w:proofErr w:type="gramEnd"/>
     </w:p>
     <w:p>
       <w:pPr>
@@ -2749,6 +2942,7 @@
         </w:numPr>
       </w:pPr>
       <w:r>
+        <w:lastRenderedPageBreak/>
         <w:t>thay đổi thuật toán runtime</w:t>
       </w:r>
     </w:p>
@@ -2799,6 +2993,58 @@
     </w:p>
     <w:p>
       <w:pPr>
+        <w:spacing w:before="100" w:beforeAutospacing="1" w:after="100" w:afterAutospacing="1" w:line="240" w:lineRule="auto"/>
+        <w:ind w:left="360" w:firstLine="0"/>
+        <w:rPr>
+          <w:rFonts w:eastAsia="Times New Roman" w:cs="Times New Roman"/>
+          <w:kern w:val="0"/>
+          <w:szCs w:val="26"/>
+          <w14:ligatures w14:val="none"/>
+        </w:rPr>
+      </w:pPr>
+      <w:r>
+        <w:rPr>
+          <w:noProof/>
+        </w:rPr>
+        <w:drawing>
+          <wp:inline distT="0" distB="0" distL="0" distR="0" wp14:anchorId="7A5A7B45" wp14:editId="59C1E0A5">
+            <wp:extent cx="5943600" cy="2866390"/>
+            <wp:effectExtent l="0" t="0" r="0" b="0"/>
+            <wp:docPr id="2" name="Picture 2"/>
+            <wp:cNvGraphicFramePr>
+              <a:graphicFrameLocks xmlns:a="http://schemas.openxmlformats.org/drawingml/2006/main" noChangeAspect="1"/>
+            </wp:cNvGraphicFramePr>
+            <a:graphic xmlns:a="http://schemas.openxmlformats.org/drawingml/2006/main">
+              <a:graphicData uri="http://schemas.openxmlformats.org/drawingml/2006/picture">
+                <pic:pic xmlns:pic="http://schemas.openxmlformats.org/drawingml/2006/picture">
+                  <pic:nvPicPr>
+                    <pic:cNvPr id="1" name=""/>
+                    <pic:cNvPicPr/>
+                  </pic:nvPicPr>
+                  <pic:blipFill>
+                    <a:blip r:embed="rId19"/>
+                    <a:stretch>
+                      <a:fillRect/>
+                    </a:stretch>
+                  </pic:blipFill>
+                  <pic:spPr>
+                    <a:xfrm>
+                      <a:off x="0" y="0"/>
+                      <a:ext cx="5943600" cy="2866390"/>
+                    </a:xfrm>
+                    <a:prstGeom prst="rect">
+                      <a:avLst/>
+                    </a:prstGeom>
+                  </pic:spPr>
+                </pic:pic>
+              </a:graphicData>
+            </a:graphic>
+          </wp:inline>
+        </w:drawing>
+      </w:r>
+    </w:p>
+    <w:p>
+      <w:pPr>
         <w:pStyle w:val="Heading1"/>
         <w:numPr>
           <w:ilvl w:val="0"/>
@@ -2830,8 +3076,22 @@
           <w:szCs w:val="26"/>
           <w14:ligatures w14:val="none"/>
         </w:rPr>
-        <w:t>T</w:t>
-      </w:r>
+        <w:t>Trong hệ thống bán hàng, khách hàng có thể thanh toán bằng nhiều phương thức khác nhau như thẻ tín dụng (Credit Card) hoặc PayPal.</w:t>
+      </w:r>
+    </w:p>
+    <w:p>
+      <w:pPr>
+        <w:pStyle w:val="ListParagraph"/>
+        <w:numPr>
+          <w:ilvl w:val="0"/>
+          <w:numId w:val="4"/>
+        </w:numPr>
+        <w:spacing w:before="100" w:beforeAutospacing="1" w:after="100" w:afterAutospacing="1" w:line="240" w:lineRule="auto"/>
+        <w:ind w:firstLine="0"/>
+        <w:rPr>
+          <w:szCs w:val="26"/>
+        </w:rPr>
+      </w:pPr>
       <w:r>
         <w:rPr>
           <w:rFonts w:eastAsia="Times New Roman" w:cs="Times New Roman"/>
@@ -2839,48 +3099,7 @@
           <w:szCs w:val="26"/>
           <w14:ligatures w14:val="none"/>
         </w:rPr>
-        <w:t>rong hệ thống bán hàng, khách hàng có thể thanh toán bằng nhiều phương thức khác nhau như thẻ tín dụng (Credit Card) hoặc PayPal.</w:t>
-      </w:r>
-    </w:p>
-    <w:p>
-      <w:pPr>
-        <w:pStyle w:val="ListParagraph"/>
-        <w:numPr>
-          <w:ilvl w:val="0"/>
-          <w:numId w:val="4"/>
-        </w:numPr>
-        <w:spacing w:before="100" w:beforeAutospacing="1" w:after="100" w:afterAutospacing="1" w:line="240" w:lineRule="auto"/>
-        <w:ind w:firstLine="0"/>
-        <w:rPr>
-          <w:szCs w:val="26"/>
-        </w:rPr>
-      </w:pPr>
-      <w:r>
-        <w:rPr>
-          <w:rFonts w:eastAsia="Times New Roman" w:cs="Times New Roman"/>
-          <w:kern w:val="0"/>
-          <w:szCs w:val="26"/>
-          <w14:ligatures w14:val="none"/>
-        </w:rPr>
-        <w:t xml:space="preserve">Cần </w:t>
-      </w:r>
-      <w:r>
-        <w:rPr>
-          <w:rFonts w:eastAsia="Times New Roman" w:cs="Times New Roman"/>
-          <w:kern w:val="0"/>
-          <w:szCs w:val="26"/>
-          <w14:ligatures w14:val="none"/>
-        </w:rPr>
-        <w:t xml:space="preserve">xây dựng một interface chung </w:t>
-      </w:r>
-      <w:r>
-        <w:rPr>
-          <w:rFonts w:eastAsia="Times New Roman" w:cs="Times New Roman"/>
-          <w:kern w:val="0"/>
-          <w:szCs w:val="26"/>
-          <w14:ligatures w14:val="none"/>
-        </w:rPr>
-        <w:t>là Payment</w:t>
+        <w:t>Cần xây dựng một interface chung là Payment</w:t>
       </w:r>
     </w:p>
     <w:p>
@@ -2908,7 +3127,7 @@
                     <pic:cNvPicPr/>
                   </pic:nvPicPr>
                   <pic:blipFill>
-                    <a:blip r:embed="rId18"/>
+                    <a:blip r:embed="rId20"/>
                     <a:stretch>
                       <a:fillRect/>
                     </a:stretch>
@@ -2964,7 +3183,7 @@
                     <pic:cNvPicPr/>
                   </pic:nvPicPr>
                   <pic:blipFill>
-                    <a:blip r:embed="rId19"/>
+                    <a:blip r:embed="rId21"/>
                     <a:stretch>
                       <a:fillRect/>
                     </a:stretch>
@@ -3010,7 +3229,7 @@
                     <pic:cNvPicPr/>
                   </pic:nvPicPr>
                   <pic:blipFill>
-                    <a:blip r:embed="rId20"/>
+                    <a:blip r:embed="rId22"/>
                     <a:stretch>
                       <a:fillRect/>
                     </a:stretch>
@@ -3113,7 +3332,7 @@
                     <pic:cNvPicPr/>
                   </pic:nvPicPr>
                   <pic:blipFill>
-                    <a:blip r:embed="rId21"/>
+                    <a:blip r:embed="rId23"/>
                     <a:stretch>
                       <a:fillRect/>
                     </a:stretch>
@@ -3139,8 +3358,13 @@
         <w:spacing w:before="100" w:beforeAutospacing="1" w:after="100" w:afterAutospacing="1" w:line="240" w:lineRule="auto"/>
         <w:ind w:firstLine="0"/>
       </w:pPr>
-      <w:r>
-        <w:t>Vd:</w:t>
+      <w:proofErr w:type="gramStart"/>
+      <w:r>
+        <w:t>Vd</w:t>
+      </w:r>
+      <w:proofErr w:type="gramEnd"/>
+      <w:r>
+        <w:t>:</w:t>
       </w:r>
     </w:p>
     <w:p>
@@ -3169,7 +3393,7 @@
                     <pic:cNvPicPr/>
                   </pic:nvPicPr>
                   <pic:blipFill>
-                    <a:blip r:embed="rId22"/>
+                    <a:blip r:embed="rId24"/>
                     <a:stretch>
                       <a:fillRect/>
                     </a:stretch>
@@ -3196,7 +3420,15 @@
         <w:ind w:firstLine="0"/>
       </w:pPr>
       <w:r>
-        <w:t>Chương trình sẽ chạy theo kiểu:</w:t>
+        <w:t xml:space="preserve">Chương trình sẽ chạy </w:t>
+      </w:r>
+      <w:proofErr w:type="gramStart"/>
+      <w:r>
+        <w:t>theo</w:t>
+      </w:r>
+      <w:proofErr w:type="gramEnd"/>
+      <w:r>
+        <w:t xml:space="preserve"> kiểu:</w:t>
       </w:r>
     </w:p>
     <w:p>
@@ -3204,27 +3436,33 @@
         <w:spacing w:before="100" w:beforeAutospacing="1" w:after="100" w:afterAutospacing="1" w:line="240" w:lineRule="auto"/>
         <w:ind w:firstLine="0"/>
       </w:pPr>
+      <w:proofErr w:type="gramStart"/>
       <w:r>
         <w:t>Discount.pay()</w:t>
       </w:r>
+      <w:proofErr w:type="gramEnd"/>
     </w:p>
     <w:p>
       <w:pPr>
         <w:spacing w:before="100" w:beforeAutospacing="1" w:after="100" w:afterAutospacing="1" w:line="240" w:lineRule="auto"/>
         <w:ind w:firstLine="0"/>
       </w:pPr>
+      <w:proofErr w:type="gramStart"/>
       <w:r>
         <w:t>ProcessingFee.pay()</w:t>
       </w:r>
+      <w:proofErr w:type="gramEnd"/>
     </w:p>
     <w:p>
       <w:pPr>
         <w:spacing w:before="100" w:beforeAutospacing="1" w:after="100" w:afterAutospacing="1" w:line="240" w:lineRule="auto"/>
         <w:ind w:firstLine="0"/>
       </w:pPr>
+      <w:proofErr w:type="gramStart"/>
       <w:r>
         <w:t>CreditCardPayment.pay()</w:t>
       </w:r>
+      <w:proofErr w:type="gramEnd"/>
     </w:p>
     <w:p>
       <w:pPr>
@@ -3232,13 +3470,15 @@
         <w:ind w:firstLine="0"/>
       </w:pPr>
       <w:r>
-        <w:t>Sau đó kết quả sẽ trả ngược lại theo thứ tự:</w:t>
-      </w:r>
-      <w:r>
-        <w:t xml:space="preserve"> </w:t>
-      </w:r>
-      <w:r>
-        <w:t>CreditCardPayment → ProcessingFee → Discount</w:t>
+        <w:t xml:space="preserve">Sau đó kết quả sẽ trả ngược lại </w:t>
+      </w:r>
+      <w:proofErr w:type="gramStart"/>
+      <w:r>
+        <w:t>theo</w:t>
+      </w:r>
+      <w:proofErr w:type="gramEnd"/>
+      <w:r>
+        <w:t xml:space="preserve"> thứ tự: CreditCardPayment → ProcessingFee → Discount</w:t>
       </w:r>
       <w:r>
         <w:t xml:space="preserve"> (VD: số tiền ban đầu 100 </w:t>
@@ -3318,6 +3558,49 @@
         <w:spacing w:before="100" w:beforeAutospacing="1" w:after="100" w:afterAutospacing="1" w:line="240" w:lineRule="auto"/>
         <w:ind w:firstLine="0"/>
       </w:pPr>
+      <w:r>
+        <w:rPr>
+          <w:noProof/>
+        </w:rPr>
+        <w:lastRenderedPageBreak/>
+        <w:drawing>
+          <wp:inline distT="0" distB="0" distL="0" distR="0" wp14:anchorId="103D5252" wp14:editId="5D6F04D9">
+            <wp:extent cx="5943600" cy="2806065"/>
+            <wp:effectExtent l="0" t="0" r="0" b="0"/>
+            <wp:docPr id="3" name="Picture 3"/>
+            <wp:cNvGraphicFramePr>
+              <a:graphicFrameLocks xmlns:a="http://schemas.openxmlformats.org/drawingml/2006/main" noChangeAspect="1"/>
+            </wp:cNvGraphicFramePr>
+            <a:graphic xmlns:a="http://schemas.openxmlformats.org/drawingml/2006/main">
+              <a:graphicData uri="http://schemas.openxmlformats.org/drawingml/2006/picture">
+                <pic:pic xmlns:pic="http://schemas.openxmlformats.org/drawingml/2006/picture">
+                  <pic:nvPicPr>
+                    <pic:cNvPr id="1" name=""/>
+                    <pic:cNvPicPr/>
+                  </pic:nvPicPr>
+                  <pic:blipFill>
+                    <a:blip r:embed="rId25"/>
+                    <a:stretch>
+                      <a:fillRect/>
+                    </a:stretch>
+                  </pic:blipFill>
+                  <pic:spPr>
+                    <a:xfrm>
+                      <a:off x="0" y="0"/>
+                      <a:ext cx="5943600" cy="2806065"/>
+                    </a:xfrm>
+                    <a:prstGeom prst="rect">
+                      <a:avLst/>
+                    </a:prstGeom>
+                  </pic:spPr>
+                </pic:pic>
+              </a:graphicData>
+            </a:graphic>
+          </wp:inline>
+        </w:drawing>
+      </w:r>
+      <w:bookmarkStart w:id="4" w:name="_GoBack"/>
+      <w:bookmarkEnd w:id="4"/>
     </w:p>
     <w:sectPr>
       <w:pgSz w:w="12240" w:h="15840"/>
@@ -3330,8 +3613,8 @@
 </file>
 
 <file path=word/numbering.xml><?xml version="1.0" encoding="utf-8"?>
-<w:numbering xmlns:wpc="http://schemas.microsoft.com/office/word/2010/wordprocessingCanvas" xmlns:cx="http://schemas.microsoft.com/office/drawing/2014/chartex" xmlns:cx1="http://schemas.microsoft.com/office/drawing/2015/9/8/chartex" xmlns:cx2="http://schemas.microsoft.com/office/drawing/2015/10/21/chartex" xmlns:cx3="http://schemas.microsoft.com/office/drawing/2016/5/9/chartex" xmlns:cx4="http://schemas.microsoft.com/office/drawing/2016/5/10/chartex" xmlns:cx5="http://schemas.microsoft.com/office/drawing/2016/5/11/chartex" xmlns:cx6="http://schemas.microsoft.com/office/drawing/2016/5/12/chartex" xmlns:cx7="http://schemas.microsoft.com/office/drawing/2016/5/13/chartex" xmlns:cx8="http://schemas.microsoft.com/office/drawing/2016/5/14/chartex" xmlns:mc="http://schemas.openxmlformats.org/markup-compatibility/2006" xmlns:aink="http://schemas.microsoft.com/office/drawing/2016/ink" xmlns:am3d="http://schemas.microsoft.com/office/drawing/2017/model3d" xmlns:o="urn:schemas-microsoft-com:office:office" xmlns:oel="http://schemas.microsoft.com/office/2019/extlst" xmlns:r="http://schemas.openxmlformats.org/officeDocument/2006/relationships" xmlns:m="http://schemas.openxmlformats.org/officeDocument/2006/math" xmlns:v="urn:schemas-microsoft-com:vml" xmlns:wp14="http://schemas.microsoft.com/office/word/2010/wordprocessingDrawing" xmlns:wp="http://schemas.openxmlformats.org/drawingml/2006/wordprocessingDrawing" xmlns:w10="urn:schemas-microsoft-com:office:word" xmlns:w="http://schemas.openxmlformats.org/wordprocessingml/2006/main" xmlns:w14="http://schemas.microsoft.com/office/word/2010/wordml" xmlns:w15="http://schemas.microsoft.com/office/word/2012/wordml" xmlns:w16cex="http://schemas.microsoft.com/office/word/2018/wordml/cex" xmlns:w16cid="http://schemas.microsoft.com/office/word/2016/wordml/cid" xmlns:w16="http://schemas.microsoft.com/office/word/2018/wordml" xmlns:w16du="http://schemas.microsoft.com/office/word/2023/wordml/word16du" xmlns:w16sdtdh="http://schemas.microsoft.com/office/word/2020/wordml/sdtdatahash" xmlns:w16sdtfl="http://schemas.microsoft.com/office/word/2024/wordml/sdtformatlock" xmlns:w16se="http://schemas.microsoft.com/office/word/2015/wordml/symex" xmlns:wpg="http://schemas.microsoft.com/office/word/2010/wordprocessingGroup" xmlns:wpi="http://schemas.microsoft.com/office/word/2010/wordprocessingInk" xmlns:wne="http://schemas.microsoft.com/office/word/2006/wordml" xmlns:wps="http://schemas.microsoft.com/office/word/2010/wordprocessingShape" mc:Ignorable="w14 w15 w16se w16cid w16 w16cex w16sdtdh w16sdtfl w16du wp14">
-  <w:abstractNum w:abstractNumId="0" w15:restartNumberingAfterBreak="0">
+<w:numbering xmlns:wpc="http://schemas.microsoft.com/office/word/2010/wordprocessingCanvas" xmlns:mc="http://schemas.openxmlformats.org/markup-compatibility/2006" xmlns:o="urn:schemas-microsoft-com:office:office" xmlns:r="http://schemas.openxmlformats.org/officeDocument/2006/relationships" xmlns:m="http://schemas.openxmlformats.org/officeDocument/2006/math" xmlns:v="urn:schemas-microsoft-com:vml" xmlns:wp14="http://schemas.microsoft.com/office/word/2010/wordprocessingDrawing" xmlns:wp="http://schemas.openxmlformats.org/drawingml/2006/wordprocessingDrawing" xmlns:w10="urn:schemas-microsoft-com:office:word" xmlns:w="http://schemas.openxmlformats.org/wordprocessingml/2006/main" xmlns:w14="http://schemas.microsoft.com/office/word/2010/wordml" xmlns:w15="http://schemas.microsoft.com/office/word/2012/wordml" xmlns:wpg="http://schemas.microsoft.com/office/word/2010/wordprocessingGroup" xmlns:wpi="http://schemas.microsoft.com/office/word/2010/wordprocessingInk" xmlns:wne="http://schemas.microsoft.com/office/word/2006/wordml" xmlns:wps="http://schemas.microsoft.com/office/word/2010/wordprocessingShape" mc:Ignorable="w14 w15 wp14">
+  <w:abstractNum w:abstractNumId="0">
     <w:nsid w:val="01A950F3"/>
     <w:multiLevelType w:val="multilevel"/>
     <w:tmpl w:val="5C689344"/>
@@ -3480,7 +3763,7 @@
       </w:rPr>
     </w:lvl>
   </w:abstractNum>
-  <w:abstractNum w:abstractNumId="1" w15:restartNumberingAfterBreak="0">
+  <w:abstractNum w:abstractNumId="1">
     <w:nsid w:val="14192F7C"/>
     <w:multiLevelType w:val="multilevel"/>
     <w:tmpl w:val="CCCAEFFA"/>
@@ -3629,7 +3912,7 @@
       </w:rPr>
     </w:lvl>
   </w:abstractNum>
-  <w:abstractNum w:abstractNumId="2" w15:restartNumberingAfterBreak="0">
+  <w:abstractNum w:abstractNumId="2">
     <w:nsid w:val="18511F0C"/>
     <w:multiLevelType w:val="hybridMultilevel"/>
     <w:tmpl w:val="0A3E3DF0"/>
@@ -3741,7 +4024,7 @@
       </w:rPr>
     </w:lvl>
   </w:abstractNum>
-  <w:abstractNum w:abstractNumId="3" w15:restartNumberingAfterBreak="0">
+  <w:abstractNum w:abstractNumId="3">
     <w:nsid w:val="3EFC17F3"/>
     <w:multiLevelType w:val="multilevel"/>
     <w:tmpl w:val="14346F1A"/>
@@ -3890,7 +4173,7 @@
       </w:rPr>
     </w:lvl>
   </w:abstractNum>
-  <w:abstractNum w:abstractNumId="4" w15:restartNumberingAfterBreak="0">
+  <w:abstractNum w:abstractNumId="4">
     <w:nsid w:val="52AE185A"/>
     <w:multiLevelType w:val="multilevel"/>
     <w:tmpl w:val="D6A296B0"/>
@@ -4039,7 +4322,7 @@
       </w:rPr>
     </w:lvl>
   </w:abstractNum>
-  <w:abstractNum w:abstractNumId="5" w15:restartNumberingAfterBreak="0">
+  <w:abstractNum w:abstractNumId="5">
     <w:nsid w:val="56F77E8E"/>
     <w:multiLevelType w:val="multilevel"/>
     <w:tmpl w:val="A2ECACC8"/>
@@ -4188,7 +4471,7 @@
       </w:rPr>
     </w:lvl>
   </w:abstractNum>
-  <w:abstractNum w:abstractNumId="6" w15:restartNumberingAfterBreak="0">
+  <w:abstractNum w:abstractNumId="6">
     <w:nsid w:val="5F907415"/>
     <w:multiLevelType w:val="multilevel"/>
     <w:tmpl w:val="2A1CD3CA"/>
@@ -4337,7 +4620,7 @@
       </w:rPr>
     </w:lvl>
   </w:abstractNum>
-  <w:abstractNum w:abstractNumId="7" w15:restartNumberingAfterBreak="0">
+  <w:abstractNum w:abstractNumId="7">
     <w:nsid w:val="619133CB"/>
     <w:multiLevelType w:val="multilevel"/>
     <w:tmpl w:val="A2A62B3A"/>
@@ -4455,7 +4738,7 @@
       </w:rPr>
     </w:lvl>
   </w:abstractNum>
-  <w:abstractNum w:abstractNumId="8" w15:restartNumberingAfterBreak="0">
+  <w:abstractNum w:abstractNumId="8">
     <w:nsid w:val="66E47894"/>
     <w:multiLevelType w:val="hybridMultilevel"/>
     <w:tmpl w:val="17D496F6"/>
@@ -4567,7 +4850,7 @@
       </w:rPr>
     </w:lvl>
   </w:abstractNum>
-  <w:abstractNum w:abstractNumId="9" w15:restartNumberingAfterBreak="0">
+  <w:abstractNum w:abstractNumId="9">
     <w:nsid w:val="71E93A5B"/>
     <w:multiLevelType w:val="multilevel"/>
     <w:tmpl w:val="E2209678"/>
@@ -4716,41 +4999,41 @@
       </w:rPr>
     </w:lvl>
   </w:abstractNum>
-  <w:num w:numId="1" w16cid:durableId="166789296">
+  <w:num w:numId="1">
     <w:abstractNumId w:val="7"/>
   </w:num>
-  <w:num w:numId="2" w16cid:durableId="1815365938">
+  <w:num w:numId="2">
     <w:abstractNumId w:val="1"/>
   </w:num>
-  <w:num w:numId="3" w16cid:durableId="822047089">
+  <w:num w:numId="3">
     <w:abstractNumId w:val="6"/>
   </w:num>
-  <w:num w:numId="4" w16cid:durableId="2113624810">
+  <w:num w:numId="4">
     <w:abstractNumId w:val="2"/>
   </w:num>
-  <w:num w:numId="5" w16cid:durableId="1729566947">
+  <w:num w:numId="5">
     <w:abstractNumId w:val="3"/>
   </w:num>
-  <w:num w:numId="6" w16cid:durableId="1116829767">
+  <w:num w:numId="6">
     <w:abstractNumId w:val="4"/>
   </w:num>
-  <w:num w:numId="7" w16cid:durableId="198475075">
+  <w:num w:numId="7">
     <w:abstractNumId w:val="9"/>
   </w:num>
-  <w:num w:numId="8" w16cid:durableId="347175575">
+  <w:num w:numId="8">
     <w:abstractNumId w:val="8"/>
   </w:num>
-  <w:num w:numId="9" w16cid:durableId="360014663">
+  <w:num w:numId="9">
     <w:abstractNumId w:val="0"/>
   </w:num>
-  <w:num w:numId="10" w16cid:durableId="215120347">
+  <w:num w:numId="10">
     <w:abstractNumId w:val="5"/>
   </w:num>
 </w:numbering>
 </file>
 
 <file path=word/styles.xml><?xml version="1.0" encoding="utf-8"?>
-<w:styles xmlns:mc="http://schemas.openxmlformats.org/markup-compatibility/2006" xmlns:r="http://schemas.openxmlformats.org/officeDocument/2006/relationships" xmlns:w="http://schemas.openxmlformats.org/wordprocessingml/2006/main" xmlns:w14="http://schemas.microsoft.com/office/word/2010/wordml" xmlns:w15="http://schemas.microsoft.com/office/word/2012/wordml" xmlns:w16cex="http://schemas.microsoft.com/office/word/2018/wordml/cex" xmlns:w16cid="http://schemas.microsoft.com/office/word/2016/wordml/cid" xmlns:w16="http://schemas.microsoft.com/office/word/2018/wordml" xmlns:w16du="http://schemas.microsoft.com/office/word/2023/wordml/word16du" xmlns:w16sdtdh="http://schemas.microsoft.com/office/word/2020/wordml/sdtdatahash" xmlns:w16sdtfl="http://schemas.microsoft.com/office/word/2024/wordml/sdtformatlock" xmlns:w16se="http://schemas.microsoft.com/office/word/2015/wordml/symex" mc:Ignorable="w14 w15 w16se w16cid w16 w16cex w16sdtdh w16sdtfl w16du">
+<w:styles xmlns:mc="http://schemas.openxmlformats.org/markup-compatibility/2006" xmlns:r="http://schemas.openxmlformats.org/officeDocument/2006/relationships" xmlns:w="http://schemas.openxmlformats.org/wordprocessingml/2006/main" xmlns:w14="http://schemas.microsoft.com/office/word/2010/wordml" xmlns:w15="http://schemas.microsoft.com/office/word/2012/wordml" mc:Ignorable="w14 w15">
   <w:docDefaults>
     <w:rPrDefault>
       <w:rPr>
@@ -4768,7 +5051,7 @@
       </w:pPr>
     </w:pPrDefault>
   </w:docDefaults>
-  <w:latentStyles w:defLockedState="0" w:defUIPriority="99" w:defSemiHidden="0" w:defUnhideWhenUsed="0" w:defQFormat="0" w:count="376">
+  <w:latentStyles w:defLockedState="0" w:defUIPriority="99" w:defSemiHidden="0" w:defUnhideWhenUsed="0" w:defQFormat="0" w:count="371">
     <w:lsdException w:name="Normal" w:uiPriority="0" w:qFormat="1"/>
     <w:lsdException w:name="heading 1" w:uiPriority="9" w:qFormat="1"/>
     <w:lsdException w:name="heading 2" w:semiHidden="1" w:uiPriority="9" w:unhideWhenUsed="1" w:qFormat="1"/>
@@ -5140,11 +5423,6 @@
     <w:lsdException w:name="List Table 5 Dark Accent 6" w:uiPriority="50"/>
     <w:lsdException w:name="List Table 6 Colorful Accent 6" w:uiPriority="51"/>
     <w:lsdException w:name="List Table 7 Colorful Accent 6" w:uiPriority="52"/>
-    <w:lsdException w:name="Mention" w:semiHidden="1" w:unhideWhenUsed="1"/>
-    <w:lsdException w:name="Smart Hyperlink" w:semiHidden="1" w:unhideWhenUsed="1"/>
-    <w:lsdException w:name="Hashtag" w:semiHidden="1" w:unhideWhenUsed="1"/>
-    <w:lsdException w:name="Unresolved Mention" w:semiHidden="1" w:unhideWhenUsed="1"/>
-    <w:lsdException w:name="Smart Link" w:semiHidden="1" w:unhideWhenUsed="1"/>
   </w:latentStyles>
   <w:style w:type="paragraph" w:default="1" w:styleId="Normal">
     <w:name w:val="Normal"/>
@@ -5362,6 +5640,7 @@
   <w:style w:type="character" w:default="1" w:styleId="DefaultParagraphFont">
     <w:name w:val="Default Paragraph Font"/>
     <w:uiPriority w:val="1"/>
+    <w:semiHidden/>
     <w:unhideWhenUsed/>
   </w:style>
   <w:style w:type="table" w:default="1" w:styleId="TableNormal">
@@ -6074,7 +6353,7 @@
 </file>
 
 <file path=customXml/itemProps1.xml><?xml version="1.0" encoding="utf-8"?>
-<ds:datastoreItem xmlns:ds="http://schemas.openxmlformats.org/officeDocument/2006/customXml" ds:itemID="{72E99C5E-D065-4590-9FD2-DF60ACD1F2C7}">
+<ds:datastoreItem xmlns:ds="http://schemas.openxmlformats.org/officeDocument/2006/customXml" ds:itemID="{C00632C0-8EFC-4675-8410-B3FF5E7218DA}">
   <ds:schemaRefs>
     <ds:schemaRef ds:uri="http://schemas.openxmlformats.org/officeDocument/2006/bibliography"/>
   </ds:schemaRefs>

</xml_diff>